<commit_message>
updated the email code and the documents
</commit_message>
<xml_diff>
--- a/docs/Novessa_Phase_1_Design_System.docx
+++ b/docs/Novessa_Phase_1_Design_System.docx
@@ -45,10 +45,11 @@
     </w:p>
     <w:tbl>
       <w:tblPr>
-        <w:tblW w:type="auto" w:w="0"/>
+        <w:tblW w:type="dxa" w:w="9360"/>
         <w:jc w:val="center"/>
         <w:tblLayout w:type="fixed"/>
         <w:tblLook w:firstColumn="1" w:firstRow="1" w:lastColumn="0" w:lastRow="0" w:noHBand="0" w:noVBand="1" w:val="04A0"/>
+        <w:tblInd w:type="dxa" w:w="120"/>
       </w:tblPr>
       <w:tblGrid>
         <w:gridCol w:w="2340"/>
@@ -62,6 +63,12 @@
             <w:tcW w:type="dxa" w:w="2340"/>
             <w:shd w:fill="00263F"/>
             <w:vAlign w:val="center"/>
+            <w:tcMar>
+              <w:top w:w="80" w:type="dxa"/>
+              <w:bottom w:w="80" w:type="dxa"/>
+              <w:start w:w="120" w:type="dxa"/>
+              <w:end w:w="120" w:type="dxa"/>
+            </w:tcMar>
           </w:tcPr>
           <w:p>
             <w:pPr>
@@ -84,6 +91,12 @@
             <w:tcW w:type="dxa" w:w="2340"/>
             <w:shd w:fill="F8F9FF"/>
             <w:vAlign w:val="center"/>
+            <w:tcMar>
+              <w:top w:w="80" w:type="dxa"/>
+              <w:bottom w:w="80" w:type="dxa"/>
+              <w:start w:w="120" w:type="dxa"/>
+              <w:end w:w="120" w:type="dxa"/>
+            </w:tcMar>
           </w:tcPr>
           <w:p>
             <w:pPr>
@@ -106,6 +119,12 @@
             <w:tcW w:type="dxa" w:w="2340"/>
             <w:shd w:fill="F8F9FF"/>
             <w:vAlign w:val="center"/>
+            <w:tcMar>
+              <w:top w:w="80" w:type="dxa"/>
+              <w:bottom w:w="80" w:type="dxa"/>
+              <w:start w:w="120" w:type="dxa"/>
+              <w:end w:w="120" w:type="dxa"/>
+            </w:tcMar>
           </w:tcPr>
           <w:p>
             <w:pPr>
@@ -128,6 +147,12 @@
             <w:tcW w:type="dxa" w:w="2340"/>
             <w:shd w:fill="F8F9FF"/>
             <w:vAlign w:val="center"/>
+            <w:tcMar>
+              <w:top w:w="80" w:type="dxa"/>
+              <w:bottom w:w="80" w:type="dxa"/>
+              <w:start w:w="120" w:type="dxa"/>
+              <w:end w:w="120" w:type="dxa"/>
+            </w:tcMar>
           </w:tcPr>
           <w:p>
             <w:pPr>
@@ -151,6 +176,12 @@
           <w:tcPr>
             <w:tcW w:type="dxa" w:w="2340"/>
             <w:vAlign w:val="center"/>
+            <w:tcMar>
+              <w:top w:w="80" w:type="dxa"/>
+              <w:bottom w:w="80" w:type="dxa"/>
+              <w:start w:w="120" w:type="dxa"/>
+              <w:end w:w="120" w:type="dxa"/>
+            </w:tcMar>
           </w:tcPr>
           <w:p>
             <w:pPr>
@@ -172,6 +203,12 @@
           <w:tcPr>
             <w:tcW w:type="dxa" w:w="2340"/>
             <w:vAlign w:val="center"/>
+            <w:tcMar>
+              <w:top w:w="80" w:type="dxa"/>
+              <w:bottom w:w="80" w:type="dxa"/>
+              <w:start w:w="120" w:type="dxa"/>
+              <w:end w:w="120" w:type="dxa"/>
+            </w:tcMar>
           </w:tcPr>
           <w:p>
             <w:pPr>
@@ -193,6 +230,12 @@
           <w:tcPr>
             <w:tcW w:type="dxa" w:w="2340"/>
             <w:vAlign w:val="center"/>
+            <w:tcMar>
+              <w:top w:w="80" w:type="dxa"/>
+              <w:bottom w:w="80" w:type="dxa"/>
+              <w:start w:w="120" w:type="dxa"/>
+              <w:end w:w="120" w:type="dxa"/>
+            </w:tcMar>
           </w:tcPr>
           <w:p>
             <w:pPr>
@@ -214,6 +257,12 @@
           <w:tcPr>
             <w:tcW w:type="dxa" w:w="2340"/>
             <w:vAlign w:val="center"/>
+            <w:tcMar>
+              <w:top w:w="80" w:type="dxa"/>
+              <w:bottom w:w="80" w:type="dxa"/>
+              <w:start w:w="120" w:type="dxa"/>
+              <w:end w:w="120" w:type="dxa"/>
+            </w:tcMar>
           </w:tcPr>
           <w:p>
             <w:pPr>
@@ -297,22 +346,29 @@
     <w:tbl>
       <w:tblPr>
         <w:tblStyle w:val="TableGrid"/>
-        <w:tblW w:type="auto" w:w="0"/>
+        <w:tblW w:type="dxa" w:w="9360"/>
         <w:jc w:val="center"/>
         <w:tblLayout w:type="fixed"/>
         <w:tblLook w:firstColumn="1" w:firstRow="1" w:lastColumn="0" w:lastRow="0" w:noHBand="0" w:noVBand="1" w:val="04A0"/>
+        <w:tblInd w:type="dxa" w:w="120"/>
       </w:tblPr>
       <w:tblGrid>
-        <w:gridCol w:w="3120"/>
-        <w:gridCol w:w="3120"/>
-        <w:gridCol w:w="3120"/>
+        <w:gridCol w:w="2050"/>
+        <w:gridCol w:w="4750"/>
+        <w:gridCol w:w="2560"/>
       </w:tblGrid>
       <w:tr>
         <w:tc>
           <w:tcPr>
-            <w:tcW w:type="dxa" w:w="1944"/>
+            <w:tcW w:type="dxa" w:w="2050"/>
             <w:shd w:fill="00263F"/>
             <w:vAlign w:val="center"/>
+            <w:tcMar>
+              <w:top w:w="80" w:type="dxa"/>
+              <w:bottom w:w="80" w:type="dxa"/>
+              <w:start w:w="120" w:type="dxa"/>
+              <w:end w:w="120" w:type="dxa"/>
+            </w:tcMar>
           </w:tcPr>
           <w:p>
             <w:pPr>
@@ -332,9 +388,15 @@
         </w:tc>
         <w:tc>
           <w:tcPr>
-            <w:tcW w:type="dxa" w:w="1656"/>
+            <w:tcW w:type="dxa" w:w="4750"/>
             <w:shd w:fill="00263F"/>
             <w:vAlign w:val="center"/>
+            <w:tcMar>
+              <w:top w:w="80" w:type="dxa"/>
+              <w:bottom w:w="80" w:type="dxa"/>
+              <w:start w:w="120" w:type="dxa"/>
+              <w:end w:w="120" w:type="dxa"/>
+            </w:tcMar>
           </w:tcPr>
           <w:p>
             <w:pPr>
@@ -354,9 +416,15 @@
         </w:tc>
         <w:tc>
           <w:tcPr>
-            <w:tcW w:type="dxa" w:w="5760"/>
+            <w:tcW w:type="dxa" w:w="2560"/>
             <w:shd w:fill="00263F"/>
             <w:vAlign w:val="center"/>
+            <w:tcMar>
+              <w:top w:w="80" w:type="dxa"/>
+              <w:bottom w:w="80" w:type="dxa"/>
+              <w:start w:w="120" w:type="dxa"/>
+              <w:end w:w="120" w:type="dxa"/>
+            </w:tcMar>
           </w:tcPr>
           <w:p>
             <w:pPr>
@@ -378,9 +446,15 @@
       <w:tr>
         <w:tc>
           <w:tcPr>
-            <w:tcW w:type="dxa" w:w="1944"/>
+            <w:tcW w:type="dxa" w:w="2050"/>
             <w:shd w:fill="F8F9FF"/>
             <w:vAlign w:val="center"/>
+            <w:tcMar>
+              <w:top w:w="80" w:type="dxa"/>
+              <w:bottom w:w="80" w:type="dxa"/>
+              <w:start w:w="120" w:type="dxa"/>
+              <w:end w:w="120" w:type="dxa"/>
+            </w:tcMar>
           </w:tcPr>
           <w:p>
             <w:pPr>
@@ -400,9 +474,15 @@
         </w:tc>
         <w:tc>
           <w:tcPr>
-            <w:tcW w:type="dxa" w:w="1656"/>
+            <w:tcW w:type="dxa" w:w="4750"/>
             <w:shd w:fill="F8F9FF"/>
             <w:vAlign w:val="center"/>
+            <w:tcMar>
+              <w:top w:w="80" w:type="dxa"/>
+              <w:bottom w:w="80" w:type="dxa"/>
+              <w:start w:w="120" w:type="dxa"/>
+              <w:end w:w="120" w:type="dxa"/>
+            </w:tcMar>
           </w:tcPr>
           <w:p>
             <w:pPr>
@@ -422,9 +502,15 @@
         </w:tc>
         <w:tc>
           <w:tcPr>
-            <w:tcW w:type="dxa" w:w="5760"/>
+            <w:tcW w:type="dxa" w:w="2560"/>
             <w:shd w:fill="F8F9FF"/>
             <w:vAlign w:val="center"/>
+            <w:tcMar>
+              <w:top w:w="80" w:type="dxa"/>
+              <w:bottom w:w="80" w:type="dxa"/>
+              <w:start w:w="120" w:type="dxa"/>
+              <w:end w:w="120" w:type="dxa"/>
+            </w:tcMar>
           </w:tcPr>
           <w:p>
             <w:pPr>
@@ -446,9 +532,15 @@
       <w:tr>
         <w:tc>
           <w:tcPr>
-            <w:tcW w:type="dxa" w:w="1944"/>
+            <w:tcW w:type="dxa" w:w="2050"/>
             <w:shd w:fill="FFFFFF"/>
             <w:vAlign w:val="center"/>
+            <w:tcMar>
+              <w:top w:w="80" w:type="dxa"/>
+              <w:bottom w:w="80" w:type="dxa"/>
+              <w:start w:w="120" w:type="dxa"/>
+              <w:end w:w="120" w:type="dxa"/>
+            </w:tcMar>
           </w:tcPr>
           <w:p>
             <w:pPr>
@@ -468,9 +560,15 @@
         </w:tc>
         <w:tc>
           <w:tcPr>
-            <w:tcW w:type="dxa" w:w="1656"/>
+            <w:tcW w:type="dxa" w:w="4750"/>
             <w:shd w:fill="FFFFFF"/>
             <w:vAlign w:val="center"/>
+            <w:tcMar>
+              <w:top w:w="80" w:type="dxa"/>
+              <w:bottom w:w="80" w:type="dxa"/>
+              <w:start w:w="120" w:type="dxa"/>
+              <w:end w:w="120" w:type="dxa"/>
+            </w:tcMar>
           </w:tcPr>
           <w:p>
             <w:pPr>
@@ -490,9 +588,15 @@
         </w:tc>
         <w:tc>
           <w:tcPr>
-            <w:tcW w:type="dxa" w:w="5760"/>
+            <w:tcW w:type="dxa" w:w="2560"/>
             <w:shd w:fill="FFFFFF"/>
             <w:vAlign w:val="center"/>
+            <w:tcMar>
+              <w:top w:w="80" w:type="dxa"/>
+              <w:bottom w:w="80" w:type="dxa"/>
+              <w:start w:w="120" w:type="dxa"/>
+              <w:end w:w="120" w:type="dxa"/>
+            </w:tcMar>
           </w:tcPr>
           <w:p>
             <w:pPr>
@@ -514,9 +618,15 @@
       <w:tr>
         <w:tc>
           <w:tcPr>
-            <w:tcW w:type="dxa" w:w="1944"/>
+            <w:tcW w:type="dxa" w:w="2050"/>
             <w:shd w:fill="F8F9FF"/>
             <w:vAlign w:val="center"/>
+            <w:tcMar>
+              <w:top w:w="80" w:type="dxa"/>
+              <w:bottom w:w="80" w:type="dxa"/>
+              <w:start w:w="120" w:type="dxa"/>
+              <w:end w:w="120" w:type="dxa"/>
+            </w:tcMar>
           </w:tcPr>
           <w:p>
             <w:pPr>
@@ -536,9 +646,15 @@
         </w:tc>
         <w:tc>
           <w:tcPr>
-            <w:tcW w:type="dxa" w:w="1656"/>
+            <w:tcW w:type="dxa" w:w="4750"/>
             <w:shd w:fill="F8F9FF"/>
             <w:vAlign w:val="center"/>
+            <w:tcMar>
+              <w:top w:w="80" w:type="dxa"/>
+              <w:bottom w:w="80" w:type="dxa"/>
+              <w:start w:w="120" w:type="dxa"/>
+              <w:end w:w="120" w:type="dxa"/>
+            </w:tcMar>
           </w:tcPr>
           <w:p>
             <w:pPr>
@@ -558,9 +674,15 @@
         </w:tc>
         <w:tc>
           <w:tcPr>
-            <w:tcW w:type="dxa" w:w="5760"/>
+            <w:tcW w:type="dxa" w:w="2560"/>
             <w:shd w:fill="F8F9FF"/>
             <w:vAlign w:val="center"/>
+            <w:tcMar>
+              <w:top w:w="80" w:type="dxa"/>
+              <w:bottom w:w="80" w:type="dxa"/>
+              <w:start w:w="120" w:type="dxa"/>
+              <w:end w:w="120" w:type="dxa"/>
+            </w:tcMar>
           </w:tcPr>
           <w:p>
             <w:pPr>
@@ -582,9 +704,15 @@
       <w:tr>
         <w:tc>
           <w:tcPr>
-            <w:tcW w:type="dxa" w:w="1944"/>
+            <w:tcW w:type="dxa" w:w="2050"/>
             <w:shd w:fill="FFFFFF"/>
             <w:vAlign w:val="center"/>
+            <w:tcMar>
+              <w:top w:w="80" w:type="dxa"/>
+              <w:bottom w:w="80" w:type="dxa"/>
+              <w:start w:w="120" w:type="dxa"/>
+              <w:end w:w="120" w:type="dxa"/>
+            </w:tcMar>
           </w:tcPr>
           <w:p>
             <w:pPr>
@@ -604,9 +732,15 @@
         </w:tc>
         <w:tc>
           <w:tcPr>
-            <w:tcW w:type="dxa" w:w="1656"/>
+            <w:tcW w:type="dxa" w:w="4750"/>
             <w:shd w:fill="FFFFFF"/>
             <w:vAlign w:val="center"/>
+            <w:tcMar>
+              <w:top w:w="80" w:type="dxa"/>
+              <w:bottom w:w="80" w:type="dxa"/>
+              <w:start w:w="120" w:type="dxa"/>
+              <w:end w:w="120" w:type="dxa"/>
+            </w:tcMar>
           </w:tcPr>
           <w:p>
             <w:pPr>
@@ -626,9 +760,15 @@
         </w:tc>
         <w:tc>
           <w:tcPr>
-            <w:tcW w:type="dxa" w:w="5760"/>
+            <w:tcW w:type="dxa" w:w="2560"/>
             <w:shd w:fill="FFFFFF"/>
             <w:vAlign w:val="center"/>
+            <w:tcMar>
+              <w:top w:w="80" w:type="dxa"/>
+              <w:bottom w:w="80" w:type="dxa"/>
+              <w:start w:w="120" w:type="dxa"/>
+              <w:end w:w="120" w:type="dxa"/>
+            </w:tcMar>
           </w:tcPr>
           <w:p>
             <w:pPr>
@@ -650,9 +790,15 @@
       <w:tr>
         <w:tc>
           <w:tcPr>
-            <w:tcW w:type="dxa" w:w="1944"/>
+            <w:tcW w:type="dxa" w:w="2050"/>
             <w:shd w:fill="F8F9FF"/>
             <w:vAlign w:val="center"/>
+            <w:tcMar>
+              <w:top w:w="80" w:type="dxa"/>
+              <w:bottom w:w="80" w:type="dxa"/>
+              <w:start w:w="120" w:type="dxa"/>
+              <w:end w:w="120" w:type="dxa"/>
+            </w:tcMar>
           </w:tcPr>
           <w:p>
             <w:pPr>
@@ -672,9 +818,15 @@
         </w:tc>
         <w:tc>
           <w:tcPr>
-            <w:tcW w:type="dxa" w:w="1656"/>
+            <w:tcW w:type="dxa" w:w="4750"/>
             <w:shd w:fill="F8F9FF"/>
             <w:vAlign w:val="center"/>
+            <w:tcMar>
+              <w:top w:w="80" w:type="dxa"/>
+              <w:bottom w:w="80" w:type="dxa"/>
+              <w:start w:w="120" w:type="dxa"/>
+              <w:end w:w="120" w:type="dxa"/>
+            </w:tcMar>
           </w:tcPr>
           <w:p>
             <w:pPr>
@@ -694,9 +846,15 @@
         </w:tc>
         <w:tc>
           <w:tcPr>
-            <w:tcW w:type="dxa" w:w="5760"/>
+            <w:tcW w:type="dxa" w:w="2560"/>
             <w:shd w:fill="F8F9FF"/>
             <w:vAlign w:val="center"/>
+            <w:tcMar>
+              <w:top w:w="80" w:type="dxa"/>
+              <w:bottom w:w="80" w:type="dxa"/>
+              <w:start w:w="120" w:type="dxa"/>
+              <w:end w:w="120" w:type="dxa"/>
+            </w:tcMar>
           </w:tcPr>
           <w:p>
             <w:pPr>
@@ -718,9 +876,15 @@
       <w:tr>
         <w:tc>
           <w:tcPr>
-            <w:tcW w:type="dxa" w:w="1944"/>
+            <w:tcW w:type="dxa" w:w="2050"/>
             <w:shd w:fill="FFFFFF"/>
             <w:vAlign w:val="center"/>
+            <w:tcMar>
+              <w:top w:w="80" w:type="dxa"/>
+              <w:bottom w:w="80" w:type="dxa"/>
+              <w:start w:w="120" w:type="dxa"/>
+              <w:end w:w="120" w:type="dxa"/>
+            </w:tcMar>
           </w:tcPr>
           <w:p>
             <w:pPr>
@@ -740,9 +904,15 @@
         </w:tc>
         <w:tc>
           <w:tcPr>
-            <w:tcW w:type="dxa" w:w="1656"/>
+            <w:tcW w:type="dxa" w:w="4750"/>
             <w:shd w:fill="FFFFFF"/>
             <w:vAlign w:val="center"/>
+            <w:tcMar>
+              <w:top w:w="80" w:type="dxa"/>
+              <w:bottom w:w="80" w:type="dxa"/>
+              <w:start w:w="120" w:type="dxa"/>
+              <w:end w:w="120" w:type="dxa"/>
+            </w:tcMar>
           </w:tcPr>
           <w:p>
             <w:pPr>
@@ -762,9 +932,15 @@
         </w:tc>
         <w:tc>
           <w:tcPr>
-            <w:tcW w:type="dxa" w:w="5760"/>
+            <w:tcW w:type="dxa" w:w="2560"/>
             <w:shd w:fill="FFFFFF"/>
             <w:vAlign w:val="center"/>
+            <w:tcMar>
+              <w:top w:w="80" w:type="dxa"/>
+              <w:bottom w:w="80" w:type="dxa"/>
+              <w:start w:w="120" w:type="dxa"/>
+              <w:end w:w="120" w:type="dxa"/>
+            </w:tcMar>
           </w:tcPr>
           <w:p>
             <w:pPr>
@@ -796,22 +972,29 @@
     <w:tbl>
       <w:tblPr>
         <w:tblStyle w:val="TableGrid"/>
-        <w:tblW w:type="auto" w:w="0"/>
+        <w:tblW w:type="dxa" w:w="9360"/>
         <w:jc w:val="center"/>
         <w:tblLayout w:type="fixed"/>
         <w:tblLook w:firstColumn="1" w:firstRow="1" w:lastColumn="0" w:lastRow="0" w:noHBand="0" w:noVBand="1" w:val="04A0"/>
+        <w:tblInd w:type="dxa" w:w="120"/>
       </w:tblPr>
       <w:tblGrid>
-        <w:gridCol w:w="3120"/>
-        <w:gridCol w:w="3120"/>
-        <w:gridCol w:w="3120"/>
+        <w:gridCol w:w="2050"/>
+        <w:gridCol w:w="4750"/>
+        <w:gridCol w:w="2560"/>
       </w:tblGrid>
       <w:tr>
         <w:tc>
           <w:tcPr>
-            <w:tcW w:type="dxa" w:w="2088"/>
+            <w:tcW w:type="dxa" w:w="2050"/>
             <w:shd w:fill="00263F"/>
             <w:vAlign w:val="center"/>
+            <w:tcMar>
+              <w:top w:w="80" w:type="dxa"/>
+              <w:bottom w:w="80" w:type="dxa"/>
+              <w:start w:w="120" w:type="dxa"/>
+              <w:end w:w="120" w:type="dxa"/>
+            </w:tcMar>
           </w:tcPr>
           <w:p>
             <w:pPr>
@@ -831,9 +1014,15 @@
         </w:tc>
         <w:tc>
           <w:tcPr>
-            <w:tcW w:type="dxa" w:w="4392"/>
+            <w:tcW w:type="dxa" w:w="4750"/>
             <w:shd w:fill="00263F"/>
             <w:vAlign w:val="center"/>
+            <w:tcMar>
+              <w:top w:w="80" w:type="dxa"/>
+              <w:bottom w:w="80" w:type="dxa"/>
+              <w:start w:w="120" w:type="dxa"/>
+              <w:end w:w="120" w:type="dxa"/>
+            </w:tcMar>
           </w:tcPr>
           <w:p>
             <w:pPr>
@@ -853,9 +1042,15 @@
         </w:tc>
         <w:tc>
           <w:tcPr>
-            <w:tcW w:type="dxa" w:w="2880"/>
+            <w:tcW w:type="dxa" w:w="2560"/>
             <w:shd w:fill="00263F"/>
             <w:vAlign w:val="center"/>
+            <w:tcMar>
+              <w:top w:w="80" w:type="dxa"/>
+              <w:bottom w:w="80" w:type="dxa"/>
+              <w:start w:w="120" w:type="dxa"/>
+              <w:end w:w="120" w:type="dxa"/>
+            </w:tcMar>
           </w:tcPr>
           <w:p>
             <w:pPr>
@@ -877,9 +1072,15 @@
       <w:tr>
         <w:tc>
           <w:tcPr>
-            <w:tcW w:type="dxa" w:w="2088"/>
+            <w:tcW w:type="dxa" w:w="2050"/>
             <w:shd w:fill="F8F9FF"/>
             <w:vAlign w:val="center"/>
+            <w:tcMar>
+              <w:top w:w="80" w:type="dxa"/>
+              <w:bottom w:w="80" w:type="dxa"/>
+              <w:start w:w="120" w:type="dxa"/>
+              <w:end w:w="120" w:type="dxa"/>
+            </w:tcMar>
           </w:tcPr>
           <w:p>
             <w:pPr>
@@ -899,9 +1100,15 @@
         </w:tc>
         <w:tc>
           <w:tcPr>
-            <w:tcW w:type="dxa" w:w="4392"/>
+            <w:tcW w:type="dxa" w:w="4750"/>
             <w:shd w:fill="F8F9FF"/>
             <w:vAlign w:val="center"/>
+            <w:tcMar>
+              <w:top w:w="80" w:type="dxa"/>
+              <w:bottom w:w="80" w:type="dxa"/>
+              <w:start w:w="120" w:type="dxa"/>
+              <w:end w:w="120" w:type="dxa"/>
+            </w:tcMar>
           </w:tcPr>
           <w:p>
             <w:pPr>
@@ -921,9 +1128,15 @@
         </w:tc>
         <w:tc>
           <w:tcPr>
-            <w:tcW w:type="dxa" w:w="2880"/>
+            <w:tcW w:type="dxa" w:w="2560"/>
             <w:shd w:fill="F8F9FF"/>
             <w:vAlign w:val="center"/>
+            <w:tcMar>
+              <w:top w:w="80" w:type="dxa"/>
+              <w:bottom w:w="80" w:type="dxa"/>
+              <w:start w:w="120" w:type="dxa"/>
+              <w:end w:w="120" w:type="dxa"/>
+            </w:tcMar>
           </w:tcPr>
           <w:p>
             <w:pPr>
@@ -945,9 +1158,15 @@
       <w:tr>
         <w:tc>
           <w:tcPr>
-            <w:tcW w:type="dxa" w:w="2088"/>
+            <w:tcW w:type="dxa" w:w="2050"/>
             <w:shd w:fill="FFFFFF"/>
             <w:vAlign w:val="center"/>
+            <w:tcMar>
+              <w:top w:w="80" w:type="dxa"/>
+              <w:bottom w:w="80" w:type="dxa"/>
+              <w:start w:w="120" w:type="dxa"/>
+              <w:end w:w="120" w:type="dxa"/>
+            </w:tcMar>
           </w:tcPr>
           <w:p>
             <w:pPr>
@@ -967,9 +1186,15 @@
         </w:tc>
         <w:tc>
           <w:tcPr>
-            <w:tcW w:type="dxa" w:w="4392"/>
+            <w:tcW w:type="dxa" w:w="4750"/>
             <w:shd w:fill="FFFFFF"/>
             <w:vAlign w:val="center"/>
+            <w:tcMar>
+              <w:top w:w="80" w:type="dxa"/>
+              <w:bottom w:w="80" w:type="dxa"/>
+              <w:start w:w="120" w:type="dxa"/>
+              <w:end w:w="120" w:type="dxa"/>
+            </w:tcMar>
           </w:tcPr>
           <w:p>
             <w:pPr>
@@ -989,9 +1214,15 @@
         </w:tc>
         <w:tc>
           <w:tcPr>
-            <w:tcW w:type="dxa" w:w="2880"/>
+            <w:tcW w:type="dxa" w:w="2560"/>
             <w:shd w:fill="FFFFFF"/>
             <w:vAlign w:val="center"/>
+            <w:tcMar>
+              <w:top w:w="80" w:type="dxa"/>
+              <w:bottom w:w="80" w:type="dxa"/>
+              <w:start w:w="120" w:type="dxa"/>
+              <w:end w:w="120" w:type="dxa"/>
+            </w:tcMar>
           </w:tcPr>
           <w:p>
             <w:pPr>
@@ -1013,9 +1244,15 @@
       <w:tr>
         <w:tc>
           <w:tcPr>
-            <w:tcW w:type="dxa" w:w="2088"/>
+            <w:tcW w:type="dxa" w:w="2050"/>
             <w:shd w:fill="F8F9FF"/>
             <w:vAlign w:val="center"/>
+            <w:tcMar>
+              <w:top w:w="80" w:type="dxa"/>
+              <w:bottom w:w="80" w:type="dxa"/>
+              <w:start w:w="120" w:type="dxa"/>
+              <w:end w:w="120" w:type="dxa"/>
+            </w:tcMar>
           </w:tcPr>
           <w:p>
             <w:pPr>
@@ -1035,9 +1272,15 @@
         </w:tc>
         <w:tc>
           <w:tcPr>
-            <w:tcW w:type="dxa" w:w="4392"/>
+            <w:tcW w:type="dxa" w:w="4750"/>
             <w:shd w:fill="F8F9FF"/>
             <w:vAlign w:val="center"/>
+            <w:tcMar>
+              <w:top w:w="80" w:type="dxa"/>
+              <w:bottom w:w="80" w:type="dxa"/>
+              <w:start w:w="120" w:type="dxa"/>
+              <w:end w:w="120" w:type="dxa"/>
+            </w:tcMar>
           </w:tcPr>
           <w:p>
             <w:pPr>
@@ -1057,9 +1300,15 @@
         </w:tc>
         <w:tc>
           <w:tcPr>
-            <w:tcW w:type="dxa" w:w="2880"/>
+            <w:tcW w:type="dxa" w:w="2560"/>
             <w:shd w:fill="F8F9FF"/>
             <w:vAlign w:val="center"/>
+            <w:tcMar>
+              <w:top w:w="80" w:type="dxa"/>
+              <w:bottom w:w="80" w:type="dxa"/>
+              <w:start w:w="120" w:type="dxa"/>
+              <w:end w:w="120" w:type="dxa"/>
+            </w:tcMar>
           </w:tcPr>
           <w:p>
             <w:pPr>
@@ -1081,9 +1330,15 @@
       <w:tr>
         <w:tc>
           <w:tcPr>
-            <w:tcW w:type="dxa" w:w="2088"/>
+            <w:tcW w:type="dxa" w:w="2050"/>
             <w:shd w:fill="FFFFFF"/>
             <w:vAlign w:val="center"/>
+            <w:tcMar>
+              <w:top w:w="80" w:type="dxa"/>
+              <w:bottom w:w="80" w:type="dxa"/>
+              <w:start w:w="120" w:type="dxa"/>
+              <w:end w:w="120" w:type="dxa"/>
+            </w:tcMar>
           </w:tcPr>
           <w:p>
             <w:pPr>
@@ -1103,9 +1358,15 @@
         </w:tc>
         <w:tc>
           <w:tcPr>
-            <w:tcW w:type="dxa" w:w="4392"/>
+            <w:tcW w:type="dxa" w:w="4750"/>
             <w:shd w:fill="FFFFFF"/>
             <w:vAlign w:val="center"/>
+            <w:tcMar>
+              <w:top w:w="80" w:type="dxa"/>
+              <w:bottom w:w="80" w:type="dxa"/>
+              <w:start w:w="120" w:type="dxa"/>
+              <w:end w:w="120" w:type="dxa"/>
+            </w:tcMar>
           </w:tcPr>
           <w:p>
             <w:pPr>
@@ -1125,9 +1386,15 @@
         </w:tc>
         <w:tc>
           <w:tcPr>
-            <w:tcW w:type="dxa" w:w="2880"/>
+            <w:tcW w:type="dxa" w:w="2560"/>
             <w:shd w:fill="FFFFFF"/>
             <w:vAlign w:val="center"/>
+            <w:tcMar>
+              <w:top w:w="80" w:type="dxa"/>
+              <w:bottom w:w="80" w:type="dxa"/>
+              <w:start w:w="120" w:type="dxa"/>
+              <w:end w:w="120" w:type="dxa"/>
+            </w:tcMar>
           </w:tcPr>
           <w:p>
             <w:pPr>
@@ -1149,9 +1416,15 @@
       <w:tr>
         <w:tc>
           <w:tcPr>
-            <w:tcW w:type="dxa" w:w="2088"/>
+            <w:tcW w:type="dxa" w:w="2050"/>
             <w:shd w:fill="F8F9FF"/>
             <w:vAlign w:val="center"/>
+            <w:tcMar>
+              <w:top w:w="80" w:type="dxa"/>
+              <w:bottom w:w="80" w:type="dxa"/>
+              <w:start w:w="120" w:type="dxa"/>
+              <w:end w:w="120" w:type="dxa"/>
+            </w:tcMar>
           </w:tcPr>
           <w:p>
             <w:pPr>
@@ -1171,9 +1444,15 @@
         </w:tc>
         <w:tc>
           <w:tcPr>
-            <w:tcW w:type="dxa" w:w="4392"/>
+            <w:tcW w:type="dxa" w:w="4750"/>
             <w:shd w:fill="F8F9FF"/>
             <w:vAlign w:val="center"/>
+            <w:tcMar>
+              <w:top w:w="80" w:type="dxa"/>
+              <w:bottom w:w="80" w:type="dxa"/>
+              <w:start w:w="120" w:type="dxa"/>
+              <w:end w:w="120" w:type="dxa"/>
+            </w:tcMar>
           </w:tcPr>
           <w:p>
             <w:pPr>
@@ -1193,9 +1472,15 @@
         </w:tc>
         <w:tc>
           <w:tcPr>
-            <w:tcW w:type="dxa" w:w="2880"/>
+            <w:tcW w:type="dxa" w:w="2560"/>
             <w:shd w:fill="F8F9FF"/>
             <w:vAlign w:val="center"/>
+            <w:tcMar>
+              <w:top w:w="80" w:type="dxa"/>
+              <w:bottom w:w="80" w:type="dxa"/>
+              <w:start w:w="120" w:type="dxa"/>
+              <w:end w:w="120" w:type="dxa"/>
+            </w:tcMar>
           </w:tcPr>
           <w:p>
             <w:pPr>

</xml_diff>